<commit_message>
QC memo: add Section 1B explaining dashboard purpose and all tabs
Inserts new Section 1B (tracked changes, 13 paragraphs) between the
dataset structure note (1A) and the QC findings table (Section 2).

Content covers: why QC matters in a panel survey context; the four
automated check categories in the Data Quality Checks tab (skip logic,
mandatory fields, out-of-range, distribution shifts, durations); the
Panel Tracking tab (attrition, PSU coverage, call interval violations,
household matrix); the new Operator Performance tab (duration z-scores,
skip violations, short-circuit gate rates, missing rates, attrition
attribution, time-of-day flags, RAG scoring — 22 red / 23 amber / 24
green as of March 2026); and the companion Cross-Round Excel report.
</commit_message>
<xml_diff>
--- a/CATI/Analysis/QC/output/L2PHL_QC_Memo_March2026_Revised.docx
+++ b/CATI/Analysis/QC/output/L2PHL_QC_Memo_March2026_Revised.docx
@@ -552,6 +552,488 @@
       <w:ins w:id="113" w:author="Claude" w:date="2026-03-22T00:00:00Z">
         <w:r>
           <w:t xml:space="preserve"/>
+        </w:r>
+      </w:ins>
+    </w:p>
+    <w:p>
+      <w:pPr>
+        <w:pBdr>
+          <w:bottom w:val="single" w:color="2E75B6" w:sz="4" w:space="4"/>
+        </w:pBdr>
+        <w:spacing w:before="320" w:after="120"/>
+        <w:rPr>
+          <w:ins w:id="118" w:author="Claude" w:date="2026-03-22T00:00:00Z"/>
+        </w:rPr>
+      </w:pPr>
+      <w:ins w:id="119" w:author="Claude" w:date="2026-03-22T00:00:00Z">
+        <w:r>
+          <w:rPr>
+            <w:rFonts w:ascii="Arial" w:cs="Arial" w:eastAsia="Arial" w:hAnsi="Arial"/>
+            <w:b/>
+            <w:bCs/>
+            <w:color w:val="1F4E79"/>
+            <w:sz w:val="26"/>
+            <w:szCs w:val="26"/>
+          </w:rPr>
+          <w:t xml:space="preserve">1B. The QC Dashboard — What It Is and Why It Matters</w:t>
+        </w:r>
+      </w:ins>
+    </w:p>
+    <w:p>
+      <w:pPr>
+        <w:spacing w:before="60" w:after="80"/>
+        <w:rPr>
+          <w:ins w:id="120" w:author="Claude" w:date="2026-03-22T00:00:00Z"/>
+        </w:rPr>
+      </w:pPr>
+      <w:ins w:id="121" w:author="Claude" w:date="2026-03-22T00:00:00Z">
+        <w:r>
+          <w:rPr>
+            <w:rFonts w:ascii="Arial" w:cs="Arial" w:eastAsia="Arial" w:hAnsi="Arial"/>
+            <w:color w:val="000000"/>
+            <w:sz w:val="21"/>
+            <w:szCs w:val="21"/>
+          </w:rPr>
+          <w:t xml:space="preserve">The live QC dashboard (linked in Section 1) is an automated HTML report that brings together every data quality check run on the L2PHL CATI panel survey into a single, navigable interface. It is rebuilt automatically each time new data are loaded into the pipeline, so its findings always reflect the most current state of the pooled dataset. The dashboard requires no software to open — it runs in any web browser — and is organized into four main pages: Data Quality Checks, Panel Tracking, Operator Performance, and (via the linked Excel file) the Cross-Round Questionnaire Report. Each page is described below.</w:t>
+        </w:r>
+      </w:ins>
+    </w:p>
+    <w:p>
+      <w:pPr>
+        <w:spacing w:before="100" w:after="40"/>
+        <w:rPr>
+          <w:ins w:id="122" w:author="Claude" w:date="2026-03-22T00:00:00Z"/>
+        </w:rPr>
+      </w:pPr>
+      <w:ins w:id="123" w:author="Claude" w:date="2026-03-22T00:00:00Z">
+        <w:r>
+          <w:rPr>
+            <w:rFonts w:ascii="Arial" w:cs="Arial" w:eastAsia="Arial" w:hAnsi="Arial"/>
+            <w:b/>
+            <w:bCs/>
+            <w:color w:val="2E75B6"/>
+            <w:sz w:val="21"/>
+            <w:szCs w:val="21"/>
+          </w:rPr>
+          <w:t xml:space="preserve">Why this matters for a panel survey</w:t>
+        </w:r>
+      </w:ins>
+    </w:p>
+    <w:p>
+      <w:pPr>
+        <w:spacing w:before="60" w:after="80"/>
+        <w:rPr>
+          <w:ins w:id="124" w:author="Claude" w:date="2026-03-22T00:00:00Z"/>
+        </w:rPr>
+      </w:pPr>
+      <w:ins w:id="125" w:author="Claude" w:date="2026-03-22T00:00:00Z">
+        <w:r>
+          <w:rPr>
+            <w:rFonts w:ascii="Arial" w:cs="Arial" w:eastAsia="Arial" w:hAnsi="Arial"/>
+            <w:color w:val="000000"/>
+            <w:sz w:val="21"/>
+            <w:szCs w:val="21"/>
+          </w:rPr>
+          <w:t xml:space="preserve">Panel surveys face a distinctive set of data quality risks that cross-sectional surveys do not. The same households and interviewers interact repeatedly across rounds, which means that a skip logic gap left unfixed in Round 1 will recur in Rounds 2 through 5, and an interviewer who learns to shortcut interviews in Round 3 will carry that behavior forward. Catching a problem early — immediately after fieldwork, before data are cleaned, labeled, and shared — is far cheaper than reconstructing what went wrong after the fact. The QC system is designed to surface both new issues (round-specific anomalies that appear for the first time) and recurring patterns (multi-round structural problems that were never fixed), and to distinguish between the two. This distinction matters: a one-round anomaly may reflect a questionnaire programming change that needs documentation; a five-round recurring pattern is almost certainly a CATI programming gap that needs a correction.</w:t>
+        </w:r>
+      </w:ins>
+    </w:p>
+    <w:p>
+      <w:pPr>
+        <w:spacing w:before="100" w:after="40"/>
+        <w:rPr>
+          <w:ins w:id="126" w:author="Claude" w:date="2026-03-22T00:00:00Z"/>
+        </w:rPr>
+      </w:pPr>
+      <w:ins w:id="127" w:author="Claude" w:date="2026-03-22T00:00:00Z">
+        <w:r>
+          <w:rPr>
+            <w:rFonts w:ascii="Arial" w:cs="Arial" w:eastAsia="Arial" w:hAnsi="Arial"/>
+            <w:b/>
+            <w:bCs/>
+            <w:color w:val="2E75B6"/>
+            <w:sz w:val="21"/>
+            <w:szCs w:val="21"/>
+          </w:rPr>
+          <w:t xml:space="preserve">Page 1: Data Quality Checks</w:t>
+        </w:r>
+      </w:ins>
+    </w:p>
+    <w:p>
+      <w:pPr>
+        <w:spacing w:before="60" w:after="80"/>
+        <w:rPr>
+          <w:ins w:id="128" w:author="Claude" w:date="2026-03-22T00:00:00Z"/>
+        </w:rPr>
+      </w:pPr>
+      <w:ins w:id="129" w:author="Claude" w:date="2026-03-22T00:00:00Z">
+        <w:r>
+          <w:rPr>
+            <w:rFonts w:ascii="Arial" w:cs="Arial" w:eastAsia="Arial" w:hAnsi="Arial"/>
+            <w:color w:val="000000"/>
+            <w:sz w:val="21"/>
+            <w:szCs w:val="21"/>
+          </w:rPr>
+          <w:t xml:space="preserve">The Data Quality Checks page runs four categories of automated checks against the pooled .dta files and displays the results in a color-coded module-by-round matrix. </w:t>
+        </w:r>
+        <w:r>
+          <w:rPr>
+            <w:rFonts w:ascii="Arial" w:cs="Arial" w:eastAsia="Arial" w:hAnsi="Arial"/>
+            <w:i/>
+            <w:iCs/>
+            <w:color w:val="000000"/>
+            <w:sz w:val="21"/>
+            <w:szCs w:val="21"/>
+          </w:rPr>
+          <w:t xml:space="preserve">Skip logic checks</w:t>
+        </w:r>
+        <w:r>
+          <w:rPr>
+            <w:rFonts w:ascii="Arial" w:cs="Arial" w:eastAsia="Arial" w:hAnsi="Arial"/>
+            <w:color w:val="000000"/>
+            <w:sz w:val="21"/>
+            <w:szCs w:val="21"/>
+          </w:rPr>
+          <w:t xml:space="preserve"> verify that branching rules in the CATI instrument are honored in the data: for instance, that a household member who reports not working (A1=2) has no values recorded for days worked (A10) or hours worked (A11). Violations indicate either a CATI programming gap or an interviewer who manually entered values in fields that should have been locked. </w:t>
+        </w:r>
+        <w:r>
+          <w:rPr>
+            <w:rFonts w:ascii="Arial" w:cs="Arial" w:eastAsia="Arial" w:hAnsi="Arial"/>
+            <w:i/>
+            <w:iCs/>
+            <w:color w:val="000000"/>
+            <w:sz w:val="21"/>
+            <w:szCs w:val="21"/>
+          </w:rPr>
+          <w:t xml:space="preserve">Mandatory field checks</w:t>
+        </w:r>
+        <w:r>
+          <w:rPr>
+            <w:rFonts w:ascii="Arial" w:cs="Arial" w:eastAsia="Arial" w:hAnsi="Arial"/>
+            <w:color w:val="000000"/>
+            <w:sz w:val="21"/>
+            <w:szCs w:val="21"/>
+          </w:rPr>
+          <w:t xml:space="preserve"> confirm that questions the instrument marks as required are never left blank. </w:t>
+        </w:r>
+        <w:r>
+          <w:rPr>
+            <w:rFonts w:ascii="Arial" w:cs="Arial" w:eastAsia="Arial" w:hAnsi="Arial"/>
+            <w:i/>
+            <w:iCs/>
+            <w:color w:val="000000"/>
+            <w:sz w:val="21"/>
+            <w:szCs w:val="21"/>
+          </w:rPr>
+          <w:t xml:space="preserve">Out-of-range checks</w:t>
+        </w:r>
+        <w:r>
+          <w:rPr>
+            <w:rFonts w:ascii="Arial" w:cs="Arial" w:eastAsia="Arial" w:hAnsi="Arial"/>
+            <w:color w:val="000000"/>
+            <w:sz w:val="21"/>
+            <w:szCs w:val="21"/>
+          </w:rPr>
+          <w:t xml:space="preserve"> flag numeric values that fall outside the valid code range defined in the questionnaire (for example, an age of 999 or a sex code of 3). </w:t>
+        </w:r>
+        <w:r>
+          <w:rPr>
+            <w:rFonts w:ascii="Arial" w:cs="Arial" w:eastAsia="Arial" w:hAnsi="Arial"/>
+            <w:i/>
+            <w:iCs/>
+            <w:color w:val="000000"/>
+            <w:sz w:val="21"/>
+            <w:szCs w:val="21"/>
+          </w:rPr>
+          <w:t xml:space="preserve">Distribution shift checks</w:t>
+        </w:r>
+        <w:r>
+          <w:rPr>
+            <w:rFonts w:ascii="Arial" w:cs="Arial" w:eastAsia="Arial" w:hAnsi="Arial"/>
+            <w:color w:val="000000"/>
+            <w:sz w:val="21"/>
+            <w:szCs w:val="21"/>
+          </w:rPr>
+          <w:t xml:space="preserve"> compare key indicator rates across consecutive rounds and alert the team when a variable shifts by more than 20 percentage points between rounds; large shifts can signal a routing change, a sample composition change, or a coding error. Finally, </w:t>
+        </w:r>
+        <w:r>
+          <w:rPr>
+            <w:rFonts w:ascii="Arial" w:cs="Arial" w:eastAsia="Arial" w:hAnsi="Arial"/>
+            <w:i/>
+            <w:iCs/>
+            <w:color w:val="000000"/>
+            <w:sz w:val="21"/>
+            <w:szCs w:val="21"/>
+          </w:rPr>
+          <w:t xml:space="preserve">interview duration checks</w:t>
+        </w:r>
+        <w:r>
+          <w:rPr>
+            <w:rFonts w:ascii="Arial" w:cs="Arial" w:eastAsia="Arial" w:hAnsi="Arial"/>
+            <w:color w:val="000000"/>
+            <w:sz w:val="21"/>
+            <w:szCs w:val="21"/>
+          </w:rPr>
+          <w:t xml:space="preserve"> flag individual interviews that are unusually short relative to the round median (under 5 minutes is treated as a strong fabrication signal; 15–22 minutes triggers a review warning), and identify modules with zero recorded duration (indicating the timer failed or the module was skipped entirely).</w:t>
+        </w:r>
+      </w:ins>
+    </w:p>
+    <w:p>
+      <w:pPr>
+        <w:spacing w:before="100" w:after="40"/>
+        <w:rPr>
+          <w:ins w:id="130" w:author="Claude" w:date="2026-03-22T00:00:00Z"/>
+        </w:rPr>
+      </w:pPr>
+      <w:ins w:id="131" w:author="Claude" w:date="2026-03-22T00:00:00Z">
+        <w:r>
+          <w:rPr>
+            <w:rFonts w:ascii="Arial" w:cs="Arial" w:eastAsia="Arial" w:hAnsi="Arial"/>
+            <w:b/>
+            <w:bCs/>
+            <w:color w:val="2E75B6"/>
+            <w:sz w:val="21"/>
+            <w:szCs w:val="21"/>
+          </w:rPr>
+          <w:t xml:space="preserve">Page 2: Panel Tracking</w:t>
+        </w:r>
+      </w:ins>
+    </w:p>
+    <w:p>
+      <w:pPr>
+        <w:spacing w:before="60" w:after="80"/>
+        <w:rPr>
+          <w:ins w:id="132" w:author="Claude" w:date="2026-03-22T00:00:00Z"/>
+        </w:rPr>
+      </w:pPr>
+      <w:ins w:id="133" w:author="Claude" w:date="2026-03-22T00:00:00Z">
+        <w:r>
+          <w:rPr>
+            <w:rFonts w:ascii="Arial" w:cs="Arial" w:eastAsia="Arial" w:hAnsi="Arial"/>
+            <w:color w:val="000000"/>
+            <w:sz w:val="21"/>
+            <w:szCs w:val="21"/>
+          </w:rPr>
+          <w:t xml:space="preserve">The Panel Tracking page monitors the longitudinal health of the sample. The attrition section shows the share of households that were interviewed in one round but missing from the next, broken down by region and by household head characteristics (gender, education). Attrition that is not random — for instance, if poorer households are consistently more likely to drop out — can invalidate comparisons across rounds and bias estimates of change over time. The PSU coverage section flags primary sampling units where an unusually high proportion of households have been lost, which can point to geographic access problems, interviewer avoidance of certain areas, or community-level events that affect willingness to participate. The Call Interval Tracker shows the number of days elapsed between consecutive interviews for each household: the protocol requires a minimum of 30 days between rounds, and intervals shorter than 20 days are logged as hard violations (red); intervals of 20–29 days are flagged as needing prior approval (amber). A household panel matrix provides a round-by-round grid of all sample households, making it easy to identify households that are repeatedly missed across rounds.</w:t>
+        </w:r>
+      </w:ins>
+    </w:p>
+    <w:p>
+      <w:pPr>
+        <w:spacing w:before="100" w:after="40"/>
+        <w:rPr>
+          <w:ins w:id="134" w:author="Claude" w:date="2026-03-22T00:00:00Z"/>
+        </w:rPr>
+      </w:pPr>
+      <w:ins w:id="135" w:author="Claude" w:date="2026-03-22T00:00:00Z">
+        <w:r>
+          <w:rPr>
+            <w:rFonts w:ascii="Arial" w:cs="Arial" w:eastAsia="Arial" w:hAnsi="Arial"/>
+            <w:b/>
+            <w:bCs/>
+            <w:color w:val="2E75B6"/>
+            <w:sz w:val="21"/>
+            <w:szCs w:val="21"/>
+          </w:rPr>
+          <w:t xml:space="preserve">Page 3: Operator Performance (added March 2026)</w:t>
+        </w:r>
+      </w:ins>
+    </w:p>
+    <w:p>
+      <w:pPr>
+        <w:spacing w:before="60" w:after="80"/>
+        <w:rPr>
+          <w:ins w:id="136" w:author="Claude" w:date="2026-03-22T00:00:00Z"/>
+        </w:rPr>
+      </w:pPr>
+      <w:ins w:id="137" w:author="Claude" w:date="2026-03-22T00:00:00Z">
+        <w:r>
+          <w:rPr>
+            <w:rFonts w:ascii="Arial" w:cs="Arial" w:eastAsia="Arial" w:hAnsi="Arial"/>
+            <w:color w:val="000000"/>
+            <w:sz w:val="21"/>
+            <w:szCs w:val="21"/>
+          </w:rPr>
+          <w:t xml:space="preserve">The Operator Performance page, introduced in March 2026, profiles each interviewer (identified by int_id in the M00 passport module, available from Round 2 onward) across a comprehensive set of behavioral quality indicators. The page is built on the principle that data quality problems are often interviewer-specific: the same skip logic violation appearing across dozens of households may reflect a single interviewer who routinely bypasses the instrument’s routing rules. By surfacing these patterns at the interviewer level, the team can focus supervision and retraining where it will have the most impact, rather than treating all violations as equally distributed across the sample.</w:t>
+        </w:r>
+      </w:ins>
+    </w:p>
+    <w:p>
+      <w:pPr>
+        <w:spacing w:before="60" w:after="80"/>
+        <w:rPr>
+          <w:ins w:id="138" w:author="Claude" w:date="2026-03-22T00:00:00Z"/>
+        </w:rPr>
+      </w:pPr>
+      <w:ins w:id="139" w:author="Claude" w:date="2026-03-22T00:00:00Z">
+        <w:r>
+          <w:rPr>
+            <w:rFonts w:ascii="Arial" w:cs="Arial" w:eastAsia="Arial" w:hAnsi="Arial"/>
+            <w:color w:val="000000"/>
+            <w:sz w:val="21"/>
+            <w:szCs w:val="21"/>
+          </w:rPr>
+          <w:t xml:space="preserve">Six dimensions are computed per interviewer. </w:t>
+        </w:r>
+        <w:r>
+          <w:rPr>
+            <w:rFonts w:ascii="Arial" w:cs="Arial" w:eastAsia="Arial" w:hAnsi="Arial"/>
+            <w:i/>
+            <w:iCs/>
+            <w:color w:val="000000"/>
+            <w:sz w:val="21"/>
+            <w:szCs w:val="21"/>
+          </w:rPr>
+          <w:t xml:space="preserve">Duration metrics</w:t>
+        </w:r>
+        <w:r>
+          <w:rPr>
+            <w:rFonts w:ascii="Arial" w:cs="Arial" w:eastAsia="Arial" w:hAnsi="Arial"/>
+            <w:color w:val="000000"/>
+            <w:sz w:val="21"/>
+            <w:szCs w:val="21"/>
+          </w:rPr>
+          <w:t xml:space="preserve"> show whether an interviewer’s interviews are systematically shorter than the fleet average, with module-level z-scores that pinpoint which section is being rushed. </w:t>
+        </w:r>
+        <w:r>
+          <w:rPr>
+            <w:rFonts w:ascii="Arial" w:cs="Arial" w:eastAsia="Arial" w:hAnsi="Arial"/>
+            <w:i/>
+            <w:iCs/>
+            <w:color w:val="000000"/>
+            <w:sz w:val="21"/>
+            <w:szCs w:val="21"/>
+          </w:rPr>
+          <w:t xml:space="preserve">Skip violation counts</w:t>
+        </w:r>
+        <w:r>
+          <w:rPr>
+            <w:rFonts w:ascii="Arial" w:cs="Arial" w:eastAsia="Arial" w:hAnsi="Arial"/>
+            <w:color w:val="000000"/>
+            <w:sz w:val="21"/>
+            <w:szCs w:val="21"/>
+          </w:rPr>
+          <w:t xml:space="preserve"> tally how often an interviewer’s interviews contain skip logic errors, making it possible to distinguish between a one-off instrument glitch and an interviewer who consistently records data in fields that should be locked. </w:t>
+        </w:r>
+        <w:r>
+          <w:rPr>
+            <w:rFonts w:ascii="Arial" w:cs="Arial" w:eastAsia="Arial" w:hAnsi="Arial"/>
+            <w:i/>
+            <w:iCs/>
+            <w:color w:val="000000"/>
+            <w:sz w:val="21"/>
+            <w:szCs w:val="21"/>
+          </w:rPr>
+          <w:t xml:space="preserve">Short-circuit gate rates</w:t>
+        </w:r>
+        <w:r>
+          <w:rPr>
+            <w:rFonts w:ascii="Arial" w:cs="Arial" w:eastAsia="Arial" w:hAnsi="Arial"/>
+            <w:color w:val="000000"/>
+            <w:sz w:val="21"/>
+            <w:szCs w:val="21"/>
+          </w:rPr>
+          <w:t xml:space="preserve"> measure how often an interviewer records an answer that causes a module to end early — for example, “no shocks” in M03, “not working” in M04, or “no bank account” in M06 — at a rate that is unusually high compared to colleagues. This is a known signal for strategic answer selection: some interviewers learn which responses shorten the survey and use them disproportionately to reduce their workload. </w:t>
+        </w:r>
+        <w:r>
+          <w:rPr>
+            <w:rFonts w:ascii="Arial" w:cs="Arial" w:eastAsia="Arial" w:hAnsi="Arial"/>
+            <w:i/>
+            <w:iCs/>
+            <w:color w:val="000000"/>
+            <w:sz w:val="21"/>
+            <w:szCs w:val="21"/>
+          </w:rPr>
+          <w:t xml:space="preserve">Missing rate analysis</w:t>
+        </w:r>
+        <w:r>
+          <w:rPr>
+            <w:rFonts w:ascii="Arial" w:cs="Arial" w:eastAsia="Arial" w:hAnsi="Arial"/>
+            <w:color w:val="000000"/>
+            <w:sz w:val="21"/>
+            <w:szCs w:val="21"/>
+          </w:rPr>
+          <w:t xml:space="preserve"> flags interviewers whose data contain more missing values on key variables than the fleet median, after excluding variables that are structurally missing by design. </w:t>
+        </w:r>
+        <w:r>
+          <w:rPr>
+            <w:rFonts w:ascii="Arial" w:cs="Arial" w:eastAsia="Arial" w:hAnsi="Arial"/>
+            <w:i/>
+            <w:iCs/>
+            <w:color w:val="000000"/>
+            <w:sz w:val="21"/>
+            <w:szCs w:val="21"/>
+          </w:rPr>
+          <w:t xml:space="preserve">Attrition attribution</w:t>
+        </w:r>
+        <w:r>
+          <w:rPr>
+            <w:rFonts w:ascii="Arial" w:cs="Arial" w:eastAsia="Arial" w:hAnsi="Arial"/>
+            <w:color w:val="000000"/>
+            <w:sz w:val="21"/>
+            <w:szCs w:val="21"/>
+          </w:rPr>
+          <w:t xml:space="preserve"> traces which households dropped out of the panel under a given interviewer’s watch, helping to distinguish global attrition from attrition that is concentrated with particular interviewers. </w:t>
+        </w:r>
+        <w:r>
+          <w:rPr>
+            <w:rFonts w:ascii="Arial" w:cs="Arial" w:eastAsia="Arial" w:hAnsi="Arial"/>
+            <w:i/>
+            <w:iCs/>
+            <w:color w:val="000000"/>
+            <w:sz w:val="21"/>
+            <w:szCs w:val="21"/>
+          </w:rPr>
+          <w:t xml:space="preserve">Time-of-day flags</w:t>
+        </w:r>
+        <w:r>
+          <w:rPr>
+            <w:rFonts w:ascii="Arial" w:cs="Arial" w:eastAsia="Arial" w:hAnsi="Arial"/>
+            <w:color w:val="000000"/>
+            <w:sz w:val="21"/>
+            <w:szCs w:val="21"/>
+          </w:rPr>
+          <w:t xml:space="preserve"> count interviews conducted during late-night or early-morning hours, which may indicate falsified timestamps or unusual fieldwork circumstances. Each interviewer receives an overall RAG (Red / Amber / Green) rating based on these combined signals, computed relative to the fleet median so that the thresholds adapt to the actual distribution of the data rather than fixed absolute values. As of the March 2026 update, the 69 active interviewers in the dataset are rated: 22 red, 23 amber, and 24 green. Clicking any interviewer row in the table opens a detail panel showing the full breakdown by module.</w:t>
+        </w:r>
+      </w:ins>
+    </w:p>
+    <w:p>
+      <w:pPr>
+        <w:spacing w:before="100" w:after="40"/>
+        <w:rPr>
+          <w:ins w:id="140" w:author="Claude" w:date="2026-03-22T00:00:00Z"/>
+        </w:rPr>
+      </w:pPr>
+      <w:ins w:id="141" w:author="Claude" w:date="2026-03-22T00:00:00Z">
+        <w:r>
+          <w:rPr>
+            <w:rFonts w:ascii="Arial" w:cs="Arial" w:eastAsia="Arial" w:hAnsi="Arial"/>
+            <w:b/>
+            <w:bCs/>
+            <w:color w:val="2E75B6"/>
+            <w:sz w:val="21"/>
+            <w:szCs w:val="21"/>
+          </w:rPr>
+          <w:t xml:space="preserve">Companion file: Cross-Round Questionnaire Report</w:t>
+        </w:r>
+      </w:ins>
+    </w:p>
+    <w:p>
+      <w:pPr>
+        <w:spacing w:before="60" w:after="80"/>
+        <w:rPr>
+          <w:ins w:id="142" w:author="Claude" w:date="2026-03-22T00:00:00Z"/>
+        </w:rPr>
+      </w:pPr>
+      <w:ins w:id="143" w:author="Claude" w:date="2026-03-22T00:00:00Z">
+        <w:r>
+          <w:rPr>
+            <w:rFonts w:ascii="Arial" w:cs="Arial" w:eastAsia="Arial" w:hAnsi="Arial"/>
+            <w:color w:val="000000"/>
+            <w:sz w:val="21"/>
+            <w:szCs w:val="21"/>
+          </w:rPr>
+          <w:t xml:space="preserve">The QC pipeline also generates an Excel cross-round questionnaire report (L2PHL_Questionnaire_Cross_Round_Report.xlsx, available in the same GitHub repository). This report tracks every question variable across all five questionnaire versions — when it first appeared, whether it was present in every round, whether its skip rules changed, and whether its response codes were modified. It is the primary reference for longitudinal analysis decisions: researchers who want to confirm that a variable is truly comparable across all five rounds, or who need to understand why a rate looks different in Round 3 compared to Round 1, should consult this report alongside the dashboard findings. The report is organized by module (M00–M09), with one worksheet per module and a summary sheet listing all variables that changed between rounds.</w:t>
         </w:r>
       </w:ins>
     </w:p>

</xml_diff>